<commit_message>
Eventleta como experiencia (fundador) en el CV y en la trayectoria, con la carrera piloto II Festival Running
Co-Authored-By: Claude Fable 5.1 <noreply@anthropic.com>
Claude-Session: https://claude.ai/code/session_013bDWBGpa6VNsescM35Nsnj
</commit_message>
<xml_diff>
--- a/public/cv/Axel-Bernal-CV-en.docx
+++ b/public/cv/Axel-Bernal-CV-en.docx
@@ -55,7 +55,7 @@
           <w:b w:val="0"/>
           <w:i w:val="0"/>
         </w:rPr>
-        <w:t>Computer systems engineer and full-stack technical lead. I lead the development of SATIUM, a tax-compliance SaaS ERP for Mexico, Chile and Peru with fourteen applications in production (FastAPI, React, PostgreSQL, Google Cloud). I have migrated legacy systems reconciling the data to the cent, and I run the platform with AI agents as part of the team. Looking for a senior full-stack or technical-lead role, remote or on-site, in Mexico or the United States; open to relocation.</w:t>
+        <w:t>Computer systems engineer and full-stack technical lead. I lead the development of SATIUM, a tax-compliance SaaS ERP for Mexico, Chile and Peru with fourteen applications in production (FastAPI, React, PostgreSQL, Google Cloud). I migrate legacy systems reconciling the data to the cent and run the platform with AI agents on the team. Seeking a senior full-stack or technical-lead role, remote or on-site, in Mexico or the United States; open to relocation.</w:t>
       </w:r>
     </w:p>
     <w:p>
@@ -191,6 +191,84 @@
           <w:b/>
           <w:i w:val="0"/>
         </w:rPr>
+        <w:t>Eventleta · eventleta.com</w:t>
+      </w:r>
+      <w:r>
+        <w:rPr>
+          <w:i w:val="0"/>
+          <w:sz w:val="19"/>
+        </w:rPr>
+        <w:tab/>
+        <w:t>2026 – present</w:t>
+      </w:r>
+    </w:p>
+    <w:p>
+      <w:pPr>
+        <w:tabs>
+          <w:tab w:pos="10512" w:val="right"/>
+        </w:tabs>
+        <w:spacing w:after="20"/>
+      </w:pPr>
+      <w:r>
+        <w:rPr>
+          <w:b w:val="0"/>
+          <w:i/>
+        </w:rPr>
+        <w:t>Founder and full-stack developer (own product)</w:t>
+      </w:r>
+      <w:r>
+        <w:rPr>
+          <w:i/>
+          <w:sz w:val="19"/>
+        </w:rPr>
+        <w:tab/>
+        <w:t>Tepic, Nayarit</w:t>
+      </w:r>
+    </w:p>
+    <w:p>
+      <w:pPr>
+        <w:pStyle w:val="ListBullet"/>
+        <w:spacing w:after="20"/>
+      </w:pPr>
+      <w:r>
+        <w:t>Registration platform for 5K, 10K and 21K races: organizers publish their race and collect payments online; runners sign up without an account and receive a QR bib to pick up their kit. In production with the pilot race II Festival Running (Tepic, November 2026).</w:t>
+      </w:r>
+    </w:p>
+    <w:p>
+      <w:pPr>
+        <w:pStyle w:val="ListBullet"/>
+        <w:spacing w:after="20"/>
+      </w:pPr>
+      <w:r>
+        <w:t>Designed and built the whole product: public portal for low-end phones, organizer dashboard with live registrations and revenue, admin with commissions and reconciliation; Mercado Pago split payments and bank transfer with review.</w:t>
+      </w:r>
+    </w:p>
+    <w:p>
+      <w:pPr>
+        <w:pStyle w:val="ListBullet"/>
+        <w:spacing w:after="20"/>
+      </w:pPr>
+      <w:r>
+        <w:t>React with TypeScript and Tailwind, FastAPI, PostgreSQL and Cloud Run; own brand kit and identity.</w:t>
+      </w:r>
+    </w:p>
+    <w:p>
+      <w:pPr>
+        <w:spacing w:after="0"/>
+      </w:pPr>
+    </w:p>
+    <w:p>
+      <w:pPr>
+        <w:tabs>
+          <w:tab w:pos="10512" w:val="right"/>
+        </w:tabs>
+        <w:spacing w:after="20"/>
+      </w:pPr>
+      <w:r>
+        <w:rPr>
+          <w:b/>
+          <w:i w:val="0"/>
+        </w:rPr>
         <w:t>SIAREX Technology</w:t>
       </w:r>
       <w:r>
@@ -300,49 +378,13 @@
         <w:spacing w:after="20"/>
       </w:pPr>
       <w:r>
-        <w:t>Club del Valle: member management system with React and Firebase, automated emails through Mailjet.</w:t>
-      </w:r>
-    </w:p>
-    <w:p>
-      <w:pPr>
-        <w:pStyle w:val="ListBullet"/>
-        <w:spacing w:after="20"/>
-      </w:pPr>
-      <w:r>
-        <w:t>Point of sale integrated with Google Sheets for La Crudelia Grill; Java desktop application for a dental office.</w:t>
+        <w:t>Member management for Club del Valle (React, Firebase, Mailjet emails); Google Sheets point of sale for La Crudelia Grill; Java desktop app for a dental office.</w:t>
       </w:r>
     </w:p>
     <w:p>
       <w:pPr>
         <w:spacing w:after="0"/>
       </w:pPr>
-    </w:p>
-    <w:p>
-      <w:pPr>
-        <w:spacing w:after="40" w:before="160"/>
-        <w:pBdr>
-          <w:bottom w:val="single" w:sz="6" w:space="1" w:color="000000"/>
-        </w:pBdr>
-      </w:pPr>
-      <w:r>
-        <w:rPr>
-          <w:b/>
-          <w:i w:val="0"/>
-          <w:sz w:val="20"/>
-        </w:rPr>
-        <w:t>PROJECTS</w:t>
-      </w:r>
-    </w:p>
-    <w:p>
-      <w:r>
-        <w:rPr>
-          <w:b/>
-        </w:rPr>
-        <w:t>Eventleta · eventleta.com · 2026</w:t>
-      </w:r>
-      <w:r>
-        <w:t>. Registration platform for 5K, 10K and 21K races: Mercado Pago payments, QR bib and organizer dashboard. React, FastAPI, PostgreSQL, Cloud Run. In production.</w:t>
-      </w:r>
     </w:p>
     <w:p>
       <w:pPr>
@@ -485,7 +527,7 @@
         <w:t xml:space="preserve">Backend: </w:t>
       </w:r>
       <w:r>
-        <w:t>Python, FastAPI, SQLAlchemy, PostgreSQL, Supabase, Pydantic, WeasyPrint, openpyxl</w:t>
+        <w:t>Python, FastAPI, SQLAlchemy, PostgreSQL, Supabase, Pydantic, WeasyPrint; Java, JavaEE / Struts, MySQL</w:t>
       </w:r>
     </w:p>
     <w:p>
@@ -524,10 +566,10 @@
         <w:rPr>
           <w:b/>
         </w:rPr>
-        <w:t xml:space="preserve">Tax: </w:t>
+        <w:t xml:space="preserve">Tax &amp; payments: </w:t>
       </w:r>
       <w:r>
-        <w:t>CFDI 4.0, SAT, PAC, SII (Chile), SUNAT (Peru), IMSS / IDSE</w:t>
+        <w:t>CFDI 4.0, SAT, PAC, SII (Chile), SUNAT (Peru), IMSS / IDSE, Mercado Pago</w:t>
       </w:r>
     </w:p>
     <w:p>
@@ -542,20 +584,6 @@
       </w:r>
       <w:r>
         <w:t>Claude Code, Codex, OpenAI API, tool calling, Playwright</w:t>
-      </w:r>
-    </w:p>
-    <w:p>
-      <w:pPr>
-        <w:spacing w:after="20"/>
-      </w:pPr>
-      <w:r>
-        <w:rPr>
-          <w:b/>
-        </w:rPr>
-        <w:t xml:space="preserve">Legacy: </w:t>
-      </w:r>
-      <w:r>
-        <w:t>Java, JavaEE / Struts, MySQL, Tomcat</w:t>
       </w:r>
     </w:p>
     <w:p>

</xml_diff>